<commit_message>
fix: fonte dos títulos e largura da coluna de ID nos documentos Word (SCRUM-34)
</commit_message>
<xml_diff>
--- a/doctos/Documentacao_Tecnica.docx
+++ b/doctos/Documentacao_Tecnica.docx
@@ -2325,7 +2325,7 @@
         </w:trPr>
         <w:tc>
           <w:tcPr>
-            <w:tcW w:type="dxa" w:w="737"/>
+            <w:tcW w:type="dxa" w:w="1134"/>
             <w:shd w:val="clear" w:fill="E1F2EC"/>
           </w:tcPr>
           <w:p>
@@ -2344,7 +2344,7 @@
         </w:tc>
         <w:tc>
           <w:tcPr>
-            <w:tcW w:type="dxa" w:w="1531"/>
+            <w:tcW w:type="dxa" w:w="1701"/>
             <w:shd w:val="clear" w:fill="E1F2EC"/>
           </w:tcPr>
           <w:p>
@@ -2363,7 +2363,7 @@
         </w:tc>
         <w:tc>
           <w:tcPr>
-            <w:tcW w:type="dxa" w:w="4139"/>
+            <w:tcW w:type="dxa" w:w="3855"/>
             <w:shd w:val="clear" w:fill="E1F2EC"/>
           </w:tcPr>
           <w:p>
@@ -2382,7 +2382,7 @@
         </w:tc>
         <w:tc>
           <w:tcPr>
-            <w:tcW w:type="dxa" w:w="2381"/>
+            <w:tcW w:type="dxa" w:w="2268"/>
             <w:shd w:val="clear" w:fill="E1F2EC"/>
           </w:tcPr>
           <w:p>
@@ -2403,7 +2403,7 @@
       <w:tr>
         <w:tc>
           <w:tcPr>
-            <w:tcW w:type="dxa" w:w="737"/>
+            <w:tcW w:type="dxa" w:w="1134"/>
           </w:tcPr>
           <w:p>
             <w:pPr>
@@ -2421,7 +2421,7 @@
         </w:tc>
         <w:tc>
           <w:tcPr>
-            <w:tcW w:type="dxa" w:w="1531"/>
+            <w:tcW w:type="dxa" w:w="1701"/>
           </w:tcPr>
           <w:p>
             <w:pPr>
@@ -2439,7 +2439,7 @@
         </w:tc>
         <w:tc>
           <w:tcPr>
-            <w:tcW w:type="dxa" w:w="4139"/>
+            <w:tcW w:type="dxa" w:w="3855"/>
           </w:tcPr>
           <w:p>
             <w:pPr>
@@ -2457,7 +2457,7 @@
         </w:tc>
         <w:tc>
           <w:tcPr>
-            <w:tcW w:type="dxa" w:w="2381"/>
+            <w:tcW w:type="dxa" w:w="2268"/>
           </w:tcPr>
           <w:p>
             <w:pPr>
@@ -2477,7 +2477,7 @@
       <w:tr>
         <w:tc>
           <w:tcPr>
-            <w:tcW w:type="dxa" w:w="737"/>
+            <w:tcW w:type="dxa" w:w="1134"/>
           </w:tcPr>
           <w:p>
             <w:pPr>
@@ -2495,7 +2495,7 @@
         </w:tc>
         <w:tc>
           <w:tcPr>
-            <w:tcW w:type="dxa" w:w="1531"/>
+            <w:tcW w:type="dxa" w:w="1701"/>
           </w:tcPr>
           <w:p>
             <w:pPr>
@@ -2513,7 +2513,7 @@
         </w:tc>
         <w:tc>
           <w:tcPr>
-            <w:tcW w:type="dxa" w:w="4139"/>
+            <w:tcW w:type="dxa" w:w="3855"/>
           </w:tcPr>
           <w:p>
             <w:pPr>
@@ -2531,7 +2531,7 @@
         </w:tc>
         <w:tc>
           <w:tcPr>
-            <w:tcW w:type="dxa" w:w="2381"/>
+            <w:tcW w:type="dxa" w:w="2268"/>
           </w:tcPr>
           <w:p>
             <w:pPr>
@@ -2551,7 +2551,7 @@
       <w:tr>
         <w:tc>
           <w:tcPr>
-            <w:tcW w:type="dxa" w:w="737"/>
+            <w:tcW w:type="dxa" w:w="1134"/>
           </w:tcPr>
           <w:p>
             <w:pPr>
@@ -2569,7 +2569,7 @@
         </w:tc>
         <w:tc>
           <w:tcPr>
-            <w:tcW w:type="dxa" w:w="1531"/>
+            <w:tcW w:type="dxa" w:w="1701"/>
           </w:tcPr>
           <w:p>
             <w:pPr>
@@ -2587,7 +2587,7 @@
         </w:tc>
         <w:tc>
           <w:tcPr>
-            <w:tcW w:type="dxa" w:w="4139"/>
+            <w:tcW w:type="dxa" w:w="3855"/>
           </w:tcPr>
           <w:p>
             <w:pPr>
@@ -2605,7 +2605,7 @@
         </w:tc>
         <w:tc>
           <w:tcPr>
-            <w:tcW w:type="dxa" w:w="2381"/>
+            <w:tcW w:type="dxa" w:w="2268"/>
           </w:tcPr>
           <w:p>
             <w:pPr>
@@ -2625,7 +2625,7 @@
       <w:tr>
         <w:tc>
           <w:tcPr>
-            <w:tcW w:type="dxa" w:w="737"/>
+            <w:tcW w:type="dxa" w:w="1134"/>
           </w:tcPr>
           <w:p>
             <w:pPr>
@@ -2643,7 +2643,7 @@
         </w:tc>
         <w:tc>
           <w:tcPr>
-            <w:tcW w:type="dxa" w:w="1531"/>
+            <w:tcW w:type="dxa" w:w="1701"/>
           </w:tcPr>
           <w:p>
             <w:pPr>
@@ -2661,7 +2661,7 @@
         </w:tc>
         <w:tc>
           <w:tcPr>
-            <w:tcW w:type="dxa" w:w="4139"/>
+            <w:tcW w:type="dxa" w:w="3855"/>
           </w:tcPr>
           <w:p>
             <w:pPr>
@@ -2679,7 +2679,7 @@
         </w:tc>
         <w:tc>
           <w:tcPr>
-            <w:tcW w:type="dxa" w:w="2381"/>
+            <w:tcW w:type="dxa" w:w="2268"/>
           </w:tcPr>
           <w:p>
             <w:pPr>
@@ -2699,7 +2699,7 @@
       <w:tr>
         <w:tc>
           <w:tcPr>
-            <w:tcW w:type="dxa" w:w="737"/>
+            <w:tcW w:type="dxa" w:w="1134"/>
           </w:tcPr>
           <w:p>
             <w:pPr>
@@ -2717,7 +2717,7 @@
         </w:tc>
         <w:tc>
           <w:tcPr>
-            <w:tcW w:type="dxa" w:w="1531"/>
+            <w:tcW w:type="dxa" w:w="1701"/>
           </w:tcPr>
           <w:p>
             <w:pPr>
@@ -2735,7 +2735,7 @@
         </w:tc>
         <w:tc>
           <w:tcPr>
-            <w:tcW w:type="dxa" w:w="4139"/>
+            <w:tcW w:type="dxa" w:w="3855"/>
           </w:tcPr>
           <w:p>
             <w:pPr>
@@ -2753,7 +2753,7 @@
         </w:tc>
         <w:tc>
           <w:tcPr>
-            <w:tcW w:type="dxa" w:w="2381"/>
+            <w:tcW w:type="dxa" w:w="2268"/>
           </w:tcPr>
           <w:p>
             <w:pPr>
@@ -2773,7 +2773,7 @@
       <w:tr>
         <w:tc>
           <w:tcPr>
-            <w:tcW w:type="dxa" w:w="737"/>
+            <w:tcW w:type="dxa" w:w="1134"/>
           </w:tcPr>
           <w:p>
             <w:pPr>
@@ -2791,7 +2791,7 @@
         </w:tc>
         <w:tc>
           <w:tcPr>
-            <w:tcW w:type="dxa" w:w="1531"/>
+            <w:tcW w:type="dxa" w:w="1701"/>
           </w:tcPr>
           <w:p>
             <w:pPr>
@@ -2809,7 +2809,7 @@
         </w:tc>
         <w:tc>
           <w:tcPr>
-            <w:tcW w:type="dxa" w:w="4139"/>
+            <w:tcW w:type="dxa" w:w="3855"/>
           </w:tcPr>
           <w:p>
             <w:pPr>
@@ -2827,7 +2827,7 @@
         </w:tc>
         <w:tc>
           <w:tcPr>
-            <w:tcW w:type="dxa" w:w="2381"/>
+            <w:tcW w:type="dxa" w:w="2268"/>
           </w:tcPr>
           <w:p>
             <w:pPr>
@@ -2847,7 +2847,7 @@
       <w:tr>
         <w:tc>
           <w:tcPr>
-            <w:tcW w:type="dxa" w:w="737"/>
+            <w:tcW w:type="dxa" w:w="1134"/>
           </w:tcPr>
           <w:p>
             <w:pPr>
@@ -2865,7 +2865,7 @@
         </w:tc>
         <w:tc>
           <w:tcPr>
-            <w:tcW w:type="dxa" w:w="1531"/>
+            <w:tcW w:type="dxa" w:w="1701"/>
           </w:tcPr>
           <w:p>
             <w:pPr>
@@ -2883,7 +2883,7 @@
         </w:tc>
         <w:tc>
           <w:tcPr>
-            <w:tcW w:type="dxa" w:w="4139"/>
+            <w:tcW w:type="dxa" w:w="3855"/>
           </w:tcPr>
           <w:p>
             <w:pPr>
@@ -2901,7 +2901,7 @@
         </w:tc>
         <w:tc>
           <w:tcPr>
-            <w:tcW w:type="dxa" w:w="2381"/>
+            <w:tcW w:type="dxa" w:w="2268"/>
           </w:tcPr>
           <w:p>
             <w:pPr>
@@ -2921,7 +2921,7 @@
       <w:tr>
         <w:tc>
           <w:tcPr>
-            <w:tcW w:type="dxa" w:w="737"/>
+            <w:tcW w:type="dxa" w:w="1134"/>
           </w:tcPr>
           <w:p>
             <w:pPr>
@@ -2939,7 +2939,7 @@
         </w:tc>
         <w:tc>
           <w:tcPr>
-            <w:tcW w:type="dxa" w:w="1531"/>
+            <w:tcW w:type="dxa" w:w="1701"/>
           </w:tcPr>
           <w:p>
             <w:pPr>
@@ -2957,7 +2957,7 @@
         </w:tc>
         <w:tc>
           <w:tcPr>
-            <w:tcW w:type="dxa" w:w="4139"/>
+            <w:tcW w:type="dxa" w:w="3855"/>
           </w:tcPr>
           <w:p>
             <w:pPr>
@@ -2975,7 +2975,7 @@
         </w:tc>
         <w:tc>
           <w:tcPr>
-            <w:tcW w:type="dxa" w:w="2381"/>
+            <w:tcW w:type="dxa" w:w="2268"/>
           </w:tcPr>
           <w:p>
             <w:pPr>
@@ -2995,7 +2995,7 @@
       <w:tr>
         <w:tc>
           <w:tcPr>
-            <w:tcW w:type="dxa" w:w="737"/>
+            <w:tcW w:type="dxa" w:w="1134"/>
           </w:tcPr>
           <w:p>
             <w:pPr>
@@ -3013,7 +3013,7 @@
         </w:tc>
         <w:tc>
           <w:tcPr>
-            <w:tcW w:type="dxa" w:w="1531"/>
+            <w:tcW w:type="dxa" w:w="1701"/>
           </w:tcPr>
           <w:p>
             <w:pPr>
@@ -3031,7 +3031,7 @@
         </w:tc>
         <w:tc>
           <w:tcPr>
-            <w:tcW w:type="dxa" w:w="4139"/>
+            <w:tcW w:type="dxa" w:w="3855"/>
           </w:tcPr>
           <w:p>
             <w:pPr>
@@ -3049,7 +3049,7 @@
         </w:tc>
         <w:tc>
           <w:tcPr>
-            <w:tcW w:type="dxa" w:w="2381"/>
+            <w:tcW w:type="dxa" w:w="2268"/>
           </w:tcPr>
           <w:p>
             <w:pPr>
@@ -3069,7 +3069,7 @@
       <w:tr>
         <w:tc>
           <w:tcPr>
-            <w:tcW w:type="dxa" w:w="737"/>
+            <w:tcW w:type="dxa" w:w="1134"/>
           </w:tcPr>
           <w:p>
             <w:pPr>
@@ -3087,7 +3087,7 @@
         </w:tc>
         <w:tc>
           <w:tcPr>
-            <w:tcW w:type="dxa" w:w="1531"/>
+            <w:tcW w:type="dxa" w:w="1701"/>
           </w:tcPr>
           <w:p>
             <w:pPr>
@@ -3105,7 +3105,7 @@
         </w:tc>
         <w:tc>
           <w:tcPr>
-            <w:tcW w:type="dxa" w:w="4139"/>
+            <w:tcW w:type="dxa" w:w="3855"/>
           </w:tcPr>
           <w:p>
             <w:pPr>
@@ -3123,7 +3123,7 @@
         </w:tc>
         <w:tc>
           <w:tcPr>
-            <w:tcW w:type="dxa" w:w="2381"/>
+            <w:tcW w:type="dxa" w:w="2268"/>
           </w:tcPr>
           <w:p>
             <w:pPr>
@@ -18133,7 +18133,7 @@
       <w:outlineLvl w:val="0"/>
     </w:pPr>
     <w:rPr>
-      <w:rFonts w:asciiTheme="majorHAnsi" w:eastAsiaTheme="majorEastAsia" w:hAnsiTheme="majorHAnsi" w:cstheme="majorBidi" w:ascii="Arial" w:hAnsi="Arial" w:eastAsia="Arial"/>
+      <w:rFonts w:ascii="Arial" w:hAnsi="Arial" w:eastAsia="Arial" w:cs="Arial"/>
       <w:b/>
       <w:bCs/>
       <w:color w:val="000000"/>
@@ -18158,7 +18158,7 @@
       <w:outlineLvl w:val="1"/>
     </w:pPr>
     <w:rPr>
-      <w:rFonts w:asciiTheme="majorHAnsi" w:eastAsiaTheme="majorEastAsia" w:hAnsiTheme="majorHAnsi" w:cstheme="majorBidi" w:ascii="Arial" w:hAnsi="Arial" w:eastAsia="Arial"/>
+      <w:rFonts w:ascii="Arial" w:hAnsi="Arial" w:eastAsia="Arial" w:cs="Arial"/>
       <w:b/>
       <w:bCs/>
       <w:color w:val="000000"/>
@@ -18183,7 +18183,7 @@
       <w:outlineLvl w:val="2"/>
     </w:pPr>
     <w:rPr>
-      <w:rFonts w:asciiTheme="majorHAnsi" w:eastAsiaTheme="majorEastAsia" w:hAnsiTheme="majorHAnsi" w:cstheme="majorBidi" w:ascii="Arial" w:hAnsi="Arial" w:eastAsia="Arial"/>
+      <w:rFonts w:ascii="Arial" w:hAnsi="Arial" w:eastAsia="Arial" w:cs="Arial"/>
       <w:b/>
       <w:bCs/>
       <w:color w:val="000000"/>

</xml_diff>